<commit_message>
docs: polish decision sheet wording for non-technical readers + D-18 id refs
</commit_message>
<xml_diff>
--- a/docs/DECISION_SHEET.docx
+++ b/docs/DECISION_SHEET.docx
@@ -1350,7 +1350,7 @@
         <w:rPr>
           <w:b w:val="0"/>
         </w:rPr>
-        <w:t>سؤال: چگونه مطمئن شویم دو پیاده‌سازیِ موتور (Python و TypeScript) دقیقاً یک عدد می‌دهند؟</w:t>
+        <w:t>سؤال: چگونه مطمئن شویم دو پیاده‌سازیِ موتور (نسخهٔ پایتون و نسخهٔ جاوااسکریپت) دقیقاً یک عدد می‌دهند؟</w:t>
       </w:r>
     </w:p>
     <w:p>
@@ -1363,7 +1363,7 @@
         <w:rPr>
           <w:b w:val="0"/>
         </w:rPr>
-        <w:t>گزینهٔ الف: حسابِ دقیقِ دهدهی (Decimal / حسابِ صحیح). الان پیاده شده.</w:t>
+        <w:t>گزینهٔ الف: حسابِ دقیقِ دهدهی بدونِ گردکردن در مراحلِ میانی. الان پیاده شده.</w:t>
       </w:r>
     </w:p>
     <w:p>
@@ -1376,7 +1376,7 @@
         <w:rPr>
           <w:b w:val="0"/>
         </w:rPr>
-        <w:t>گزینهٔ ب: استفاده از گردکردنِ سادهٔ float.</w:t>
+        <w:t>گزینهٔ ب: استفاده از گردکردنِ ساده در هر مرحله.</w:t>
       </w:r>
     </w:p>
     <w:p>
@@ -1389,7 +1389,7 @@
         <w:rPr>
           <w:b w:val="0"/>
         </w:rPr>
-        <w:t>اثرِ عددی: صفر — تضمینِ bit-identical.</w:t>
+        <w:t>اثرِ عددی: صفر — تضمین می‌شود که هر دو نسخه تا آخرین ریال یکی باشند.</w:t>
       </w:r>
     </w:p>
     <w:p>
@@ -2437,7 +2437,7 @@
         <w:rPr>
           <w:b w:val="0"/>
         </w:rPr>
-        <w:t>گزینهٔ الف: از فایلِ config (قابلِ به‌روزرسانی). الان پیاده شده.</w:t>
+        <w:t>گزینهٔ الف: از فایلِ تنظیماتِ برنامه (قابلِ به‌روزرسانی بدونِ تغییرِ کد). الان پیاده شده.</w:t>
       </w:r>
     </w:p>
     <w:p>
@@ -2476,7 +2476,7 @@
         <w:rPr>
           <w:b w:val="0"/>
         </w:rPr>
-        <w:t>توصیهٔ ما: الف — اگر بخشنامه آستانه را تغییر داد، فقط config عوض می‌شود.</w:t>
+        <w:t>توصیهٔ ما: الف — اگر بخشنامه آستانه را تغییر داد، فقط یک فایلِ تنظیمات عوض می‌شود.</w:t>
       </w:r>
     </w:p>
     <w:tbl>

</xml_diff>

<commit_message>
e9-1: measure real decision impact on reference project (D-03/D-13/D-15/D-16 are NOT zero) + T117 parity
</commit_message>
<xml_diff>
--- a/docs/DECISION_SHEET.docx
+++ b/docs/DECISION_SHEET.docx
@@ -235,6 +235,185 @@
           <w:b/>
           <w:sz w:val="26"/>
         </w:rPr>
+        <w:t>D-13 — فصولِ بدونِ شاخصِ گروهی</w:t>
+      </w:r>
+    </w:p>
+    <w:p>
+      <w:pPr>
+        <w:bidi/>
+        <w:spacing w:after="120"/>
+        <w:jc w:val="right"/>
+      </w:pPr>
+      <w:r>
+        <w:rPr>
+          <w:b w:val="0"/>
+          <w:sz w:val="18"/>
+        </w:rPr>
+        <w:t>بند/مرجع: بند ۲-۱</w:t>
+      </w:r>
+    </w:p>
+    <w:p>
+      <w:pPr>
+        <w:bidi/>
+        <w:spacing w:after="120"/>
+        <w:jc w:val="right"/>
+      </w:pPr>
+      <w:r>
+        <w:rPr>
+          <w:b w:val="0"/>
+        </w:rPr>
+        <w:t>سؤال: در مسیرِ رشته‌ای، فصولی که شاخصِ گروهی ندارند چه کنند؟</w:t>
+      </w:r>
+    </w:p>
+    <w:p>
+      <w:pPr>
+        <w:bidi/>
+        <w:spacing w:after="120"/>
+        <w:jc w:val="right"/>
+      </w:pPr>
+      <w:r>
+        <w:rPr>
+          <w:b w:val="0"/>
+        </w:rPr>
+        <w:t>گزینهٔ الف: همه از شاخصِ رشته استفاده می‌کنند. الان پیاده شده.</w:t>
+      </w:r>
+    </w:p>
+    <w:p>
+      <w:pPr>
+        <w:bidi/>
+        <w:spacing w:after="120"/>
+        <w:jc w:val="right"/>
+      </w:pPr>
+      <w:r>
+        <w:rPr>
+          <w:b w:val="0"/>
+        </w:rPr>
+        <w:t>گزینهٔ ب: فقط فصولِ بی‌شاخص.</w:t>
+      </w:r>
+    </w:p>
+    <w:p>
+      <w:pPr>
+        <w:bidi/>
+        <w:spacing w:after="120"/>
+        <w:jc w:val="right"/>
+      </w:pPr>
+      <w:r>
+        <w:rPr>
+          <w:b w:val="0"/>
+        </w:rPr>
+        <w:t>اثرِ عددی: در صورتِ اجبارِ مسیرِ رشته‌ای: ΔP = ۹.۷۳ میلیارد ریال (-۲۵۸,۳۲۲,۸۸۷.۳۲ ریال) و برآورد = ۴۶.۱۷ میلیارد ریال (+۷۳۴,۴۲۷,۴۷۱.۶۴ ریال) — صفر نیست (اندازه‌گیریِ E-9 §۱).</w:t>
+      </w:r>
+    </w:p>
+    <w:p>
+      <w:pPr>
+        <w:bidi/>
+        <w:spacing w:after="120"/>
+        <w:jc w:val="right"/>
+      </w:pPr>
+      <w:r>
+        <w:rPr>
+          <w:b w:val="0"/>
+        </w:rPr>
+        <w:t>توصیهٔ ما: الف.</w:t>
+      </w:r>
+    </w:p>
+    <w:tbl>
+      <w:tblPr>
+        <w:tblStyle w:val="TableGrid"/>
+        <w:tblW w:type="auto" w:w="0"/>
+        <w:tblLook w:firstColumn="1" w:firstRow="1" w:lastColumn="0" w:lastRow="0" w:noHBand="0" w:noVBand="1" w:val="04A0"/>
+      </w:tblPr>
+      <w:tblGrid>
+        <w:gridCol w:w="2880"/>
+        <w:gridCol w:w="2880"/>
+        <w:gridCol w:w="2880"/>
+      </w:tblGrid>
+      <w:tr>
+        <w:tc>
+          <w:tcPr>
+            <w:tcW w:type="dxa" w:w="2880"/>
+          </w:tcPr>
+          <w:p>
+            <w:pPr>
+              <w:bidi/>
+              <w:jc w:val="right"/>
+            </w:pPr>
+            <w:r>
+              <w:rPr>
+                <w:b/>
+              </w:rPr>
+              <w:t>تصمیم</w:t>
+            </w:r>
+          </w:p>
+        </w:tc>
+        <w:tc>
+          <w:tcPr>
+            <w:tcW w:type="dxa" w:w="2880"/>
+          </w:tcPr>
+          <w:p>
+            <w:pPr>
+              <w:bidi/>
+              <w:jc w:val="right"/>
+            </w:pPr>
+            <w:r>
+              <w:rPr>
+                <w:b/>
+              </w:rPr>
+              <w:t>امضا</w:t>
+            </w:r>
+          </w:p>
+        </w:tc>
+        <w:tc>
+          <w:tcPr>
+            <w:tcW w:type="dxa" w:w="2880"/>
+          </w:tcPr>
+          <w:p>
+            <w:pPr>
+              <w:bidi/>
+              <w:jc w:val="right"/>
+            </w:pPr>
+            <w:r>
+              <w:rPr>
+                <w:b/>
+              </w:rPr>
+              <w:t>تاریخ</w:t>
+            </w:r>
+          </w:p>
+        </w:tc>
+      </w:tr>
+      <w:tr>
+        <w:tc>
+          <w:tcPr>
+            <w:tcW w:type="dxa" w:w="2880"/>
+          </w:tcPr>
+          <w:p/>
+        </w:tc>
+        <w:tc>
+          <w:tcPr>
+            <w:tcW w:type="dxa" w:w="2880"/>
+          </w:tcPr>
+          <w:p/>
+        </w:tc>
+        <w:tc>
+          <w:tcPr>
+            <w:tcW w:type="dxa" w:w="2880"/>
+          </w:tcPr>
+          <w:p/>
+        </w:tc>
+      </w:tr>
+    </w:tbl>
+    <w:p/>
+    <w:p>
+      <w:pPr>
+        <w:bidi/>
+        <w:spacing w:after="120"/>
+        <w:jc w:val="right"/>
+      </w:pPr>
+      <w:r>
+        <w:rPr>
+          <w:b/>
+          <w:sz w:val="26"/>
+        </w:rPr>
         <w:t>D-01 — ضریب k: ۰٫۹۵ یا ۱</w:t>
       </w:r>
     </w:p>
@@ -593,6 +772,543 @@
           <w:b/>
           <w:sz w:val="26"/>
         </w:rPr>
+        <w:t>D-15 — دورهٔ شاخصِ مبنا برای کارِ جدید ناموجود</w:t>
+      </w:r>
+    </w:p>
+    <w:p>
+      <w:pPr>
+        <w:bidi/>
+        <w:spacing w:after="120"/>
+        <w:jc w:val="right"/>
+      </w:pPr>
+      <w:r>
+        <w:rPr>
+          <w:b w:val="0"/>
+          <w:sz w:val="18"/>
+        </w:rPr>
+        <w:t>بند/مرجع: بندهای ۳-۲ / ۳-۳</w:t>
+      </w:r>
+    </w:p>
+    <w:p>
+      <w:pPr>
+        <w:bidi/>
+        <w:spacing w:after="120"/>
+        <w:jc w:val="right"/>
+      </w:pPr>
+      <w:r>
+        <w:rPr>
+          <w:b w:val="0"/>
+        </w:rPr>
+        <w:t>سؤال: اگر کاربر دورهٔ شاخصِ مبنا را برای کارِ جدید وارد نکرده بود چه شود؟</w:t>
+      </w:r>
+    </w:p>
+    <w:p>
+      <w:pPr>
+        <w:bidi/>
+        <w:spacing w:after="120"/>
+        <w:jc w:val="right"/>
+      </w:pPr>
+      <w:r>
+        <w:rPr>
+          <w:b w:val="0"/>
+        </w:rPr>
+        <w:t>گزینهٔ الف: ردیف ساخته نمی‌شود + هشدار. الان پیاده شده.</w:t>
+      </w:r>
+    </w:p>
+    <w:p>
+      <w:pPr>
+        <w:bidi/>
+        <w:spacing w:after="120"/>
+        <w:jc w:val="right"/>
+      </w:pPr>
+      <w:r>
+        <w:rPr>
+          <w:b w:val="0"/>
+        </w:rPr>
+        <w:t>گزینهٔ ب: استفاده از آخرین دورهٔ موجود.</w:t>
+      </w:r>
+    </w:p>
+    <w:p>
+      <w:pPr>
+        <w:bidi/>
+        <w:spacing w:after="120"/>
+        <w:jc w:val="right"/>
+      </w:pPr>
+      <w:r>
+        <w:rPr>
+          <w:b w:val="0"/>
+        </w:rPr>
+        <w:t>اثرِ عددی: در سناریوی کارِ جدیدِ ۱ میلیارد ریالی (روشِ قیمت روز، دورهٔ ۱۴۰۴Q1): ΔP به جای صفر = +۲۸۰,۸۸۷,۹۴۷.۴۳ ریال و برآورد = +۱,۳۳۳,۴۶۳,۵۸۰.۷۳ ریال (اندازه‌گیریِ E-9 §۱ — صفر نیست).</w:t>
+      </w:r>
+    </w:p>
+    <w:p>
+      <w:pPr>
+        <w:bidi/>
+        <w:spacing w:after="120"/>
+        <w:jc w:val="right"/>
+      </w:pPr>
+      <w:r>
+        <w:rPr>
+          <w:b w:val="0"/>
+        </w:rPr>
+        <w:t>توصیهٔ ما: الف — حدس زدنِ دوره، خلافِ قاعدهٔ طلایی است.</w:t>
+      </w:r>
+    </w:p>
+    <w:tbl>
+      <w:tblPr>
+        <w:tblStyle w:val="TableGrid"/>
+        <w:tblW w:type="auto" w:w="0"/>
+        <w:tblLook w:firstColumn="1" w:firstRow="1" w:lastColumn="0" w:lastRow="0" w:noHBand="0" w:noVBand="1" w:val="04A0"/>
+      </w:tblPr>
+      <w:tblGrid>
+        <w:gridCol w:w="2880"/>
+        <w:gridCol w:w="2880"/>
+        <w:gridCol w:w="2880"/>
+      </w:tblGrid>
+      <w:tr>
+        <w:tc>
+          <w:tcPr>
+            <w:tcW w:type="dxa" w:w="2880"/>
+          </w:tcPr>
+          <w:p>
+            <w:pPr>
+              <w:bidi/>
+              <w:jc w:val="right"/>
+            </w:pPr>
+            <w:r>
+              <w:rPr>
+                <w:b/>
+              </w:rPr>
+              <w:t>تصمیم</w:t>
+            </w:r>
+          </w:p>
+        </w:tc>
+        <w:tc>
+          <w:tcPr>
+            <w:tcW w:type="dxa" w:w="2880"/>
+          </w:tcPr>
+          <w:p>
+            <w:pPr>
+              <w:bidi/>
+              <w:jc w:val="right"/>
+            </w:pPr>
+            <w:r>
+              <w:rPr>
+                <w:b/>
+              </w:rPr>
+              <w:t>امضا</w:t>
+            </w:r>
+          </w:p>
+        </w:tc>
+        <w:tc>
+          <w:tcPr>
+            <w:tcW w:type="dxa" w:w="2880"/>
+          </w:tcPr>
+          <w:p>
+            <w:pPr>
+              <w:bidi/>
+              <w:jc w:val="right"/>
+            </w:pPr>
+            <w:r>
+              <w:rPr>
+                <w:b/>
+              </w:rPr>
+              <w:t>تاریخ</w:t>
+            </w:r>
+          </w:p>
+        </w:tc>
+      </w:tr>
+      <w:tr>
+        <w:tc>
+          <w:tcPr>
+            <w:tcW w:type="dxa" w:w="2880"/>
+          </w:tcPr>
+          <w:p/>
+        </w:tc>
+        <w:tc>
+          <w:tcPr>
+            <w:tcW w:type="dxa" w:w="2880"/>
+          </w:tcPr>
+          <w:p/>
+        </w:tc>
+        <w:tc>
+          <w:tcPr>
+            <w:tcW w:type="dxa" w:w="2880"/>
+          </w:tcPr>
+          <w:p/>
+        </w:tc>
+      </w:tr>
+    </w:tbl>
+    <w:p/>
+    <w:p>
+      <w:pPr>
+        <w:bidi/>
+        <w:spacing w:after="120"/>
+        <w:jc w:val="right"/>
+      </w:pPr>
+      <w:r>
+        <w:rPr>
+          <w:b/>
+          <w:sz w:val="26"/>
+        </w:rPr>
+        <w:t>D-03 — روشِ گردکردن</w:t>
+      </w:r>
+    </w:p>
+    <w:p>
+      <w:pPr>
+        <w:bidi/>
+        <w:spacing w:after="120"/>
+        <w:jc w:val="right"/>
+      </w:pPr>
+      <w:r>
+        <w:rPr>
+          <w:b w:val="0"/>
+          <w:sz w:val="18"/>
+        </w:rPr>
+        <w:t>بند/مرجع: بند ۸-۲</w:t>
+      </w:r>
+    </w:p>
+    <w:p>
+      <w:pPr>
+        <w:bidi/>
+        <w:spacing w:after="120"/>
+        <w:jc w:val="right"/>
+      </w:pPr>
+      <w:r>
+        <w:rPr>
+          <w:b w:val="0"/>
+        </w:rPr>
+        <w:t>سؤال: وقتی رقمِ سومِ اعشار ۵ یا بیشتر است، گردکردن چگونه باشد؟</w:t>
+      </w:r>
+    </w:p>
+    <w:p>
+      <w:pPr>
+        <w:bidi/>
+        <w:spacing w:after="120"/>
+        <w:jc w:val="right"/>
+      </w:pPr>
+      <w:r>
+        <w:rPr>
+          <w:b w:val="0"/>
+        </w:rPr>
+        <w:t>گزینهٔ الف: اول ۳ رقم حساب، بعد بالا گرد (مثلاً ۰٫۱۲۵۰ → ۰٫۱۳). الان پیاده شده.</w:t>
+      </w:r>
+    </w:p>
+    <w:p>
+      <w:pPr>
+        <w:bidi/>
+        <w:spacing w:after="120"/>
+        <w:jc w:val="right"/>
+      </w:pPr>
+      <w:r>
+        <w:rPr>
+          <w:b w:val="0"/>
+        </w:rPr>
+        <w:t>گزینهٔ ب: گردکردنِ مستقیم به ۲ رقم (یا خاموش کردنِ گردکردن).</w:t>
+      </w:r>
+    </w:p>
+    <w:p>
+      <w:pPr>
+        <w:bidi/>
+        <w:spacing w:after="120"/>
+        <w:jc w:val="right"/>
+      </w:pPr>
+      <w:r>
+        <w:rPr>
+          <w:b w:val="0"/>
+        </w:rPr>
+        <w:t>اثرِ عددی: ΔP از ۹.۹۸ به ۹.۹۴ میلیارد ریال یعنی -۴۶,۸۶۹,۵۳۰.۵۸ ریال (اندازه‌گیریِ E-9 §۱ — صفر نیست). برآورد تغییر نمی‌کند.</w:t>
+      </w:r>
+    </w:p>
+    <w:p>
+      <w:pPr>
+        <w:bidi/>
+        <w:spacing w:after="120"/>
+        <w:jc w:val="right"/>
+      </w:pPr>
+      <w:r>
+        <w:rPr>
+          <w:b w:val="0"/>
+        </w:rPr>
+        <w:t>توصیهٔ ما: الف — در عمل با ب یکی است، ولی الف دقیق‌تر.</w:t>
+      </w:r>
+    </w:p>
+    <w:tbl>
+      <w:tblPr>
+        <w:tblStyle w:val="TableGrid"/>
+        <w:tblW w:type="auto" w:w="0"/>
+        <w:tblLook w:firstColumn="1" w:firstRow="1" w:lastColumn="0" w:lastRow="0" w:noHBand="0" w:noVBand="1" w:val="04A0"/>
+      </w:tblPr>
+      <w:tblGrid>
+        <w:gridCol w:w="2880"/>
+        <w:gridCol w:w="2880"/>
+        <w:gridCol w:w="2880"/>
+      </w:tblGrid>
+      <w:tr>
+        <w:tc>
+          <w:tcPr>
+            <w:tcW w:type="dxa" w:w="2880"/>
+          </w:tcPr>
+          <w:p>
+            <w:pPr>
+              <w:bidi/>
+              <w:jc w:val="right"/>
+            </w:pPr>
+            <w:r>
+              <w:rPr>
+                <w:b/>
+              </w:rPr>
+              <w:t>تصمیم</w:t>
+            </w:r>
+          </w:p>
+        </w:tc>
+        <w:tc>
+          <w:tcPr>
+            <w:tcW w:type="dxa" w:w="2880"/>
+          </w:tcPr>
+          <w:p>
+            <w:pPr>
+              <w:bidi/>
+              <w:jc w:val="right"/>
+            </w:pPr>
+            <w:r>
+              <w:rPr>
+                <w:b/>
+              </w:rPr>
+              <w:t>امضا</w:t>
+            </w:r>
+          </w:p>
+        </w:tc>
+        <w:tc>
+          <w:tcPr>
+            <w:tcW w:type="dxa" w:w="2880"/>
+          </w:tcPr>
+          <w:p>
+            <w:pPr>
+              <w:bidi/>
+              <w:jc w:val="right"/>
+            </w:pPr>
+            <w:r>
+              <w:rPr>
+                <w:b/>
+              </w:rPr>
+              <w:t>تاریخ</w:t>
+            </w:r>
+          </w:p>
+        </w:tc>
+      </w:tr>
+      <w:tr>
+        <w:tc>
+          <w:tcPr>
+            <w:tcW w:type="dxa" w:w="2880"/>
+          </w:tcPr>
+          <w:p/>
+        </w:tc>
+        <w:tc>
+          <w:tcPr>
+            <w:tcW w:type="dxa" w:w="2880"/>
+          </w:tcPr>
+          <w:p/>
+        </w:tc>
+        <w:tc>
+          <w:tcPr>
+            <w:tcW w:type="dxa" w:w="2880"/>
+          </w:tcPr>
+          <w:p/>
+        </w:tc>
+      </w:tr>
+    </w:tbl>
+    <w:p/>
+    <w:p>
+      <w:pPr>
+        <w:bidi/>
+        <w:spacing w:after="120"/>
+        <w:jc w:val="right"/>
+      </w:pPr>
+      <w:r>
+        <w:rPr>
+          <w:b/>
+          <w:sz w:val="26"/>
+        </w:rPr>
+        <w:t>D-16 — روشِ نامعتبرِ کارِ جدید</w:t>
+      </w:r>
+    </w:p>
+    <w:p>
+      <w:pPr>
+        <w:bidi/>
+        <w:spacing w:after="120"/>
+        <w:jc w:val="right"/>
+      </w:pPr>
+      <w:r>
+        <w:rPr>
+          <w:b w:val="0"/>
+          <w:sz w:val="18"/>
+        </w:rPr>
+        <w:t>بند/مرجع: بندهای ۳-۱ تا ۳-۵</w:t>
+      </w:r>
+    </w:p>
+    <w:p>
+      <w:pPr>
+        <w:bidi/>
+        <w:spacing w:after="120"/>
+        <w:jc w:val="right"/>
+      </w:pPr>
+      <w:r>
+        <w:rPr>
+          <w:b w:val="0"/>
+        </w:rPr>
+        <w:t>سؤال: اگر روشِ قیمت‌گذاریِ کارِ جدید مجاز نبود چه شود؟</w:t>
+      </w:r>
+    </w:p>
+    <w:p>
+      <w:pPr>
+        <w:bidi/>
+        <w:spacing w:after="120"/>
+        <w:jc w:val="right"/>
+      </w:pPr>
+      <w:r>
+        <w:rPr>
+          <w:b w:val="0"/>
+        </w:rPr>
+        <w:t>گزینهٔ الف: برگشت به روشِ «فهرست پیمان». الان پیاده شده.</w:t>
+      </w:r>
+    </w:p>
+    <w:p>
+      <w:pPr>
+        <w:bidi/>
+        <w:spacing w:after="120"/>
+        <w:jc w:val="right"/>
+      </w:pPr>
+      <w:r>
+        <w:rPr>
+          <w:b w:val="0"/>
+        </w:rPr>
+        <w:t>گزینهٔ ب: خطا و توقفِ موتور.</w:t>
+      </w:r>
+    </w:p>
+    <w:p>
+      <w:pPr>
+        <w:bidi/>
+        <w:spacing w:after="120"/>
+        <w:jc w:val="right"/>
+      </w:pPr>
+      <w:r>
+        <w:rPr>
+          <w:b w:val="0"/>
+        </w:rPr>
+        <w:t>اثرِ عددی: تفاوتِ ΔP بین «فهرست پیمان» و «قیمت روز» برای کارِ جدیدِ ۱ میلیارد ریالی = -۲۸,۹۴۲,۱۴۹.۶۶ ریال و برآورد = -۱۳۷,۳۹۷,۵۰۲.۷۳ ریال (اندازه‌گیریِ E-9 §۱).</w:t>
+      </w:r>
+    </w:p>
+    <w:p>
+      <w:pPr>
+        <w:bidi/>
+        <w:spacing w:after="120"/>
+        <w:jc w:val="right"/>
+      </w:pPr>
+      <w:r>
+        <w:rPr>
+          <w:b w:val="0"/>
+        </w:rPr>
+        <w:t>توصیهٔ ما: الف — ادامه با یک پیش‌فرضِ مکتوب بهتر از توقف است.</w:t>
+      </w:r>
+    </w:p>
+    <w:tbl>
+      <w:tblPr>
+        <w:tblStyle w:val="TableGrid"/>
+        <w:tblW w:type="auto" w:w="0"/>
+        <w:tblLook w:firstColumn="1" w:firstRow="1" w:lastColumn="0" w:lastRow="0" w:noHBand="0" w:noVBand="1" w:val="04A0"/>
+      </w:tblPr>
+      <w:tblGrid>
+        <w:gridCol w:w="2880"/>
+        <w:gridCol w:w="2880"/>
+        <w:gridCol w:w="2880"/>
+      </w:tblGrid>
+      <w:tr>
+        <w:tc>
+          <w:tcPr>
+            <w:tcW w:type="dxa" w:w="2880"/>
+          </w:tcPr>
+          <w:p>
+            <w:pPr>
+              <w:bidi/>
+              <w:jc w:val="right"/>
+            </w:pPr>
+            <w:r>
+              <w:rPr>
+                <w:b/>
+              </w:rPr>
+              <w:t>تصمیم</w:t>
+            </w:r>
+          </w:p>
+        </w:tc>
+        <w:tc>
+          <w:tcPr>
+            <w:tcW w:type="dxa" w:w="2880"/>
+          </w:tcPr>
+          <w:p>
+            <w:pPr>
+              <w:bidi/>
+              <w:jc w:val="right"/>
+            </w:pPr>
+            <w:r>
+              <w:rPr>
+                <w:b/>
+              </w:rPr>
+              <w:t>امضا</w:t>
+            </w:r>
+          </w:p>
+        </w:tc>
+        <w:tc>
+          <w:tcPr>
+            <w:tcW w:type="dxa" w:w="2880"/>
+          </w:tcPr>
+          <w:p>
+            <w:pPr>
+              <w:bidi/>
+              <w:jc w:val="right"/>
+            </w:pPr>
+            <w:r>
+              <w:rPr>
+                <w:b/>
+              </w:rPr>
+              <w:t>تاریخ</w:t>
+            </w:r>
+          </w:p>
+        </w:tc>
+      </w:tr>
+      <w:tr>
+        <w:tc>
+          <w:tcPr>
+            <w:tcW w:type="dxa" w:w="2880"/>
+          </w:tcPr>
+          <w:p/>
+        </w:tc>
+        <w:tc>
+          <w:tcPr>
+            <w:tcW w:type="dxa" w:w="2880"/>
+          </w:tcPr>
+          <w:p/>
+        </w:tc>
+        <w:tc>
+          <w:tcPr>
+            <w:tcW w:type="dxa" w:w="2880"/>
+          </w:tcPr>
+          <w:p/>
+        </w:tc>
+      </w:tr>
+    </w:tbl>
+    <w:p/>
+    <w:p>
+      <w:pPr>
+        <w:bidi/>
+        <w:spacing w:after="120"/>
+        <w:jc w:val="right"/>
+      </w:pPr>
+      <w:r>
+        <w:rPr>
+          <w:b/>
+          <w:sz w:val="26"/>
+        </w:rPr>
         <w:t>D-20 — مصالحِ پای‌کار</w:t>
       </w:r>
     </w:p>
@@ -965,185 +1681,6 @@
           <w:b/>
           <w:sz w:val="26"/>
         </w:rPr>
-        <w:t>D-03 — روشِ گردکردن</w:t>
-      </w:r>
-    </w:p>
-    <w:p>
-      <w:pPr>
-        <w:bidi/>
-        <w:spacing w:after="120"/>
-        <w:jc w:val="right"/>
-      </w:pPr>
-      <w:r>
-        <w:rPr>
-          <w:b w:val="0"/>
-          <w:sz w:val="18"/>
-        </w:rPr>
-        <w:t>بند/مرجع: بند ۸-۲</w:t>
-      </w:r>
-    </w:p>
-    <w:p>
-      <w:pPr>
-        <w:bidi/>
-        <w:spacing w:after="120"/>
-        <w:jc w:val="right"/>
-      </w:pPr>
-      <w:r>
-        <w:rPr>
-          <w:b w:val="0"/>
-        </w:rPr>
-        <w:t>سؤال: وقتی رقمِ سومِ اعشار ۵ یا بیشتر است، گردکردن چگونه باشد؟</w:t>
-      </w:r>
-    </w:p>
-    <w:p>
-      <w:pPr>
-        <w:bidi/>
-        <w:spacing w:after="120"/>
-        <w:jc w:val="right"/>
-      </w:pPr>
-      <w:r>
-        <w:rPr>
-          <w:b w:val="0"/>
-        </w:rPr>
-        <w:t>گزینهٔ الف: اول ۳ رقم حساب، بعد بالا گرد (مثلاً ۰٫۱۲۵۰ → ۰٫۱۳). الان پیاده شده.</w:t>
-      </w:r>
-    </w:p>
-    <w:p>
-      <w:pPr>
-        <w:bidi/>
-        <w:spacing w:after="120"/>
-        <w:jc w:val="right"/>
-      </w:pPr>
-      <w:r>
-        <w:rPr>
-          <w:b w:val="0"/>
-        </w:rPr>
-        <w:t>گزینهٔ ب: گردکردنِ مستقیم به ۲ رقم.</w:t>
-      </w:r>
-    </w:p>
-    <w:p>
-      <w:pPr>
-        <w:bidi/>
-        <w:spacing w:after="120"/>
-        <w:jc w:val="right"/>
-      </w:pPr>
-      <w:r>
-        <w:rPr>
-          <w:b w:val="0"/>
-        </w:rPr>
-        <w:t>اثرِ عددی: صفر — حداکثر ۰٫۰۰۵ تفاوت در هر ضریب.</w:t>
-      </w:r>
-    </w:p>
-    <w:p>
-      <w:pPr>
-        <w:bidi/>
-        <w:spacing w:after="120"/>
-        <w:jc w:val="right"/>
-      </w:pPr>
-      <w:r>
-        <w:rPr>
-          <w:b w:val="0"/>
-        </w:rPr>
-        <w:t>توصیهٔ ما: الف — در عمل با ب یکی است، ولی الف دقیق‌تر.</w:t>
-      </w:r>
-    </w:p>
-    <w:tbl>
-      <w:tblPr>
-        <w:tblStyle w:val="TableGrid"/>
-        <w:tblW w:type="auto" w:w="0"/>
-        <w:tblLook w:firstColumn="1" w:firstRow="1" w:lastColumn="0" w:lastRow="0" w:noHBand="0" w:noVBand="1" w:val="04A0"/>
-      </w:tblPr>
-      <w:tblGrid>
-        <w:gridCol w:w="2880"/>
-        <w:gridCol w:w="2880"/>
-        <w:gridCol w:w="2880"/>
-      </w:tblGrid>
-      <w:tr>
-        <w:tc>
-          <w:tcPr>
-            <w:tcW w:type="dxa" w:w="2880"/>
-          </w:tcPr>
-          <w:p>
-            <w:pPr>
-              <w:bidi/>
-              <w:jc w:val="right"/>
-            </w:pPr>
-            <w:r>
-              <w:rPr>
-                <w:b/>
-              </w:rPr>
-              <w:t>تصمیم</w:t>
-            </w:r>
-          </w:p>
-        </w:tc>
-        <w:tc>
-          <w:tcPr>
-            <w:tcW w:type="dxa" w:w="2880"/>
-          </w:tcPr>
-          <w:p>
-            <w:pPr>
-              <w:bidi/>
-              <w:jc w:val="right"/>
-            </w:pPr>
-            <w:r>
-              <w:rPr>
-                <w:b/>
-              </w:rPr>
-              <w:t>امضا</w:t>
-            </w:r>
-          </w:p>
-        </w:tc>
-        <w:tc>
-          <w:tcPr>
-            <w:tcW w:type="dxa" w:w="2880"/>
-          </w:tcPr>
-          <w:p>
-            <w:pPr>
-              <w:bidi/>
-              <w:jc w:val="right"/>
-            </w:pPr>
-            <w:r>
-              <w:rPr>
-                <w:b/>
-              </w:rPr>
-              <w:t>تاریخ</w:t>
-            </w:r>
-          </w:p>
-        </w:tc>
-      </w:tr>
-      <w:tr>
-        <w:tc>
-          <w:tcPr>
-            <w:tcW w:type="dxa" w:w="2880"/>
-          </w:tcPr>
-          <w:p/>
-        </w:tc>
-        <w:tc>
-          <w:tcPr>
-            <w:tcW w:type="dxa" w:w="2880"/>
-          </w:tcPr>
-          <w:p/>
-        </w:tc>
-        <w:tc>
-          <w:tcPr>
-            <w:tcW w:type="dxa" w:w="2880"/>
-          </w:tcPr>
-          <w:p/>
-        </w:tc>
-      </w:tr>
-    </w:tbl>
-    <w:p/>
-    <w:p>
-      <w:pPr>
-        <w:bidi/>
-        <w:spacing w:after="120"/>
-        <w:jc w:val="right"/>
-      </w:pPr>
-      <w:r>
-        <w:rPr>
-          <w:b/>
-          <w:sz w:val="26"/>
-        </w:rPr>
         <w:t>D-04 — ضرایبِ منفی</w:t>
       </w:r>
     </w:p>
@@ -2463,7 +3000,7 @@
         <w:rPr>
           <w:b w:val="0"/>
         </w:rPr>
-        <w:t>اثرِ عددی: صفر با مقدارِ فعلی.</w:t>
+        <w:t>اثرِ عددی: با مقدارِ فعلیِ آستانه (۳۰۰M) صفر — چون grand_total = ۳۱٫۴B بزرگ‌تر است و مسیرِ گروهی گرفته می‌شود. اگر آستانه از grand_total بیشتر شود، مسیرِ رشته‌ای اجبار می‌شود که اثرش = ۲۵۸٬۳۲۲٬۸۸۷٫۳۲ ریال روی ΔP (همان D-13؛ اندازه‌گیریِ E-9 §۱).</w:t>
       </w:r>
     </w:p>
     <w:p>
@@ -2656,543 +3193,6 @@
           <w:b w:val="0"/>
         </w:rPr>
         <w:t>توصیهٔ ما: الف.</w:t>
-      </w:r>
-    </w:p>
-    <w:tbl>
-      <w:tblPr>
-        <w:tblStyle w:val="TableGrid"/>
-        <w:tblW w:type="auto" w:w="0"/>
-        <w:tblLook w:firstColumn="1" w:firstRow="1" w:lastColumn="0" w:lastRow="0" w:noHBand="0" w:noVBand="1" w:val="04A0"/>
-      </w:tblPr>
-      <w:tblGrid>
-        <w:gridCol w:w="2880"/>
-        <w:gridCol w:w="2880"/>
-        <w:gridCol w:w="2880"/>
-      </w:tblGrid>
-      <w:tr>
-        <w:tc>
-          <w:tcPr>
-            <w:tcW w:type="dxa" w:w="2880"/>
-          </w:tcPr>
-          <w:p>
-            <w:pPr>
-              <w:bidi/>
-              <w:jc w:val="right"/>
-            </w:pPr>
-            <w:r>
-              <w:rPr>
-                <w:b/>
-              </w:rPr>
-              <w:t>تصمیم</w:t>
-            </w:r>
-          </w:p>
-        </w:tc>
-        <w:tc>
-          <w:tcPr>
-            <w:tcW w:type="dxa" w:w="2880"/>
-          </w:tcPr>
-          <w:p>
-            <w:pPr>
-              <w:bidi/>
-              <w:jc w:val="right"/>
-            </w:pPr>
-            <w:r>
-              <w:rPr>
-                <w:b/>
-              </w:rPr>
-              <w:t>امضا</w:t>
-            </w:r>
-          </w:p>
-        </w:tc>
-        <w:tc>
-          <w:tcPr>
-            <w:tcW w:type="dxa" w:w="2880"/>
-          </w:tcPr>
-          <w:p>
-            <w:pPr>
-              <w:bidi/>
-              <w:jc w:val="right"/>
-            </w:pPr>
-            <w:r>
-              <w:rPr>
-                <w:b/>
-              </w:rPr>
-              <w:t>تاریخ</w:t>
-            </w:r>
-          </w:p>
-        </w:tc>
-      </w:tr>
-      <w:tr>
-        <w:tc>
-          <w:tcPr>
-            <w:tcW w:type="dxa" w:w="2880"/>
-          </w:tcPr>
-          <w:p/>
-        </w:tc>
-        <w:tc>
-          <w:tcPr>
-            <w:tcW w:type="dxa" w:w="2880"/>
-          </w:tcPr>
-          <w:p/>
-        </w:tc>
-        <w:tc>
-          <w:tcPr>
-            <w:tcW w:type="dxa" w:w="2880"/>
-          </w:tcPr>
-          <w:p/>
-        </w:tc>
-      </w:tr>
-    </w:tbl>
-    <w:p/>
-    <w:p>
-      <w:pPr>
-        <w:bidi/>
-        <w:spacing w:after="120"/>
-        <w:jc w:val="right"/>
-      </w:pPr>
-      <w:r>
-        <w:rPr>
-          <w:b/>
-          <w:sz w:val="26"/>
-        </w:rPr>
-        <w:t>D-13 — فصولِ بدونِ شاخصِ گروهی</w:t>
-      </w:r>
-    </w:p>
-    <w:p>
-      <w:pPr>
-        <w:bidi/>
-        <w:spacing w:after="120"/>
-        <w:jc w:val="right"/>
-      </w:pPr>
-      <w:r>
-        <w:rPr>
-          <w:b w:val="0"/>
-          <w:sz w:val="18"/>
-        </w:rPr>
-        <w:t>بند/مرجع: بند ۲-۱</w:t>
-      </w:r>
-    </w:p>
-    <w:p>
-      <w:pPr>
-        <w:bidi/>
-        <w:spacing w:after="120"/>
-        <w:jc w:val="right"/>
-      </w:pPr>
-      <w:r>
-        <w:rPr>
-          <w:b w:val="0"/>
-        </w:rPr>
-        <w:t>سؤال: در مسیرِ رشته‌ای، فصولی که شاخصِ گروهی ندارند چه کنند؟</w:t>
-      </w:r>
-    </w:p>
-    <w:p>
-      <w:pPr>
-        <w:bidi/>
-        <w:spacing w:after="120"/>
-        <w:jc w:val="right"/>
-      </w:pPr>
-      <w:r>
-        <w:rPr>
-          <w:b w:val="0"/>
-        </w:rPr>
-        <w:t>گزینهٔ الف: همه از شاخصِ رشته استفاده می‌کنند. الان پیاده شده.</w:t>
-      </w:r>
-    </w:p>
-    <w:p>
-      <w:pPr>
-        <w:bidi/>
-        <w:spacing w:after="120"/>
-        <w:jc w:val="right"/>
-      </w:pPr>
-      <w:r>
-        <w:rPr>
-          <w:b w:val="0"/>
-        </w:rPr>
-        <w:t>گزینهٔ ب: فقط فصولِ بی‌شاخص.</w:t>
-      </w:r>
-    </w:p>
-    <w:p>
-      <w:pPr>
-        <w:bidi/>
-        <w:spacing w:after="120"/>
-        <w:jc w:val="right"/>
-      </w:pPr>
-      <w:r>
-        <w:rPr>
-          <w:b w:val="0"/>
-        </w:rPr>
-        <w:t>اثرِ عددی: صفر در پروژهٔ مرجع (مسیرِ پیش‌فرض گروهی است).</w:t>
-      </w:r>
-    </w:p>
-    <w:p>
-      <w:pPr>
-        <w:bidi/>
-        <w:spacing w:after="120"/>
-        <w:jc w:val="right"/>
-      </w:pPr>
-      <w:r>
-        <w:rPr>
-          <w:b w:val="0"/>
-        </w:rPr>
-        <w:t>توصیهٔ ما: الف.</w:t>
-      </w:r>
-    </w:p>
-    <w:tbl>
-      <w:tblPr>
-        <w:tblStyle w:val="TableGrid"/>
-        <w:tblW w:type="auto" w:w="0"/>
-        <w:tblLook w:firstColumn="1" w:firstRow="1" w:lastColumn="0" w:lastRow="0" w:noHBand="0" w:noVBand="1" w:val="04A0"/>
-      </w:tblPr>
-      <w:tblGrid>
-        <w:gridCol w:w="2880"/>
-        <w:gridCol w:w="2880"/>
-        <w:gridCol w:w="2880"/>
-      </w:tblGrid>
-      <w:tr>
-        <w:tc>
-          <w:tcPr>
-            <w:tcW w:type="dxa" w:w="2880"/>
-          </w:tcPr>
-          <w:p>
-            <w:pPr>
-              <w:bidi/>
-              <w:jc w:val="right"/>
-            </w:pPr>
-            <w:r>
-              <w:rPr>
-                <w:b/>
-              </w:rPr>
-              <w:t>تصمیم</w:t>
-            </w:r>
-          </w:p>
-        </w:tc>
-        <w:tc>
-          <w:tcPr>
-            <w:tcW w:type="dxa" w:w="2880"/>
-          </w:tcPr>
-          <w:p>
-            <w:pPr>
-              <w:bidi/>
-              <w:jc w:val="right"/>
-            </w:pPr>
-            <w:r>
-              <w:rPr>
-                <w:b/>
-              </w:rPr>
-              <w:t>امضا</w:t>
-            </w:r>
-          </w:p>
-        </w:tc>
-        <w:tc>
-          <w:tcPr>
-            <w:tcW w:type="dxa" w:w="2880"/>
-          </w:tcPr>
-          <w:p>
-            <w:pPr>
-              <w:bidi/>
-              <w:jc w:val="right"/>
-            </w:pPr>
-            <w:r>
-              <w:rPr>
-                <w:b/>
-              </w:rPr>
-              <w:t>تاریخ</w:t>
-            </w:r>
-          </w:p>
-        </w:tc>
-      </w:tr>
-      <w:tr>
-        <w:tc>
-          <w:tcPr>
-            <w:tcW w:type="dxa" w:w="2880"/>
-          </w:tcPr>
-          <w:p/>
-        </w:tc>
-        <w:tc>
-          <w:tcPr>
-            <w:tcW w:type="dxa" w:w="2880"/>
-          </w:tcPr>
-          <w:p/>
-        </w:tc>
-        <w:tc>
-          <w:tcPr>
-            <w:tcW w:type="dxa" w:w="2880"/>
-          </w:tcPr>
-          <w:p/>
-        </w:tc>
-      </w:tr>
-    </w:tbl>
-    <w:p/>
-    <w:p>
-      <w:pPr>
-        <w:bidi/>
-        <w:spacing w:after="120"/>
-        <w:jc w:val="right"/>
-      </w:pPr>
-      <w:r>
-        <w:rPr>
-          <w:b/>
-          <w:sz w:val="26"/>
-        </w:rPr>
-        <w:t>D-15 — دورهٔ شاخصِ مبنا برای کارِ جدید ناموجود</w:t>
-      </w:r>
-    </w:p>
-    <w:p>
-      <w:pPr>
-        <w:bidi/>
-        <w:spacing w:after="120"/>
-        <w:jc w:val="right"/>
-      </w:pPr>
-      <w:r>
-        <w:rPr>
-          <w:b w:val="0"/>
-          <w:sz w:val="18"/>
-        </w:rPr>
-        <w:t>بند/مرجع: بندهای ۳-۲ / ۳-۳</w:t>
-      </w:r>
-    </w:p>
-    <w:p>
-      <w:pPr>
-        <w:bidi/>
-        <w:spacing w:after="120"/>
-        <w:jc w:val="right"/>
-      </w:pPr>
-      <w:r>
-        <w:rPr>
-          <w:b w:val="0"/>
-        </w:rPr>
-        <w:t>سؤال: اگر کاربر دورهٔ شاخصِ مبنا را برای کارِ جدید وارد نکرده بود چه شود؟</w:t>
-      </w:r>
-    </w:p>
-    <w:p>
-      <w:pPr>
-        <w:bidi/>
-        <w:spacing w:after="120"/>
-        <w:jc w:val="right"/>
-      </w:pPr>
-      <w:r>
-        <w:rPr>
-          <w:b w:val="0"/>
-        </w:rPr>
-        <w:t>گزینهٔ الف: ردیف ساخته نمی‌شود + هشدار. الان پیاده شده.</w:t>
-      </w:r>
-    </w:p>
-    <w:p>
-      <w:pPr>
-        <w:bidi/>
-        <w:spacing w:after="120"/>
-        <w:jc w:val="right"/>
-      </w:pPr>
-      <w:r>
-        <w:rPr>
-          <w:b w:val="0"/>
-        </w:rPr>
-        <w:t>گزینهٔ ب: استفاده از آخرین دورهٔ موجود.</w:t>
-      </w:r>
-    </w:p>
-    <w:p>
-      <w:pPr>
-        <w:bidi/>
-        <w:spacing w:after="120"/>
-        <w:jc w:val="right"/>
-      </w:pPr>
-      <w:r>
-        <w:rPr>
-          <w:b w:val="0"/>
-        </w:rPr>
-        <w:t>اثرِ عددی: صفر — کارِ جدید کاملاً نادیده گرفته می‌شود.</w:t>
-      </w:r>
-    </w:p>
-    <w:p>
-      <w:pPr>
-        <w:bidi/>
-        <w:spacing w:after="120"/>
-        <w:jc w:val="right"/>
-      </w:pPr>
-      <w:r>
-        <w:rPr>
-          <w:b w:val="0"/>
-        </w:rPr>
-        <w:t>توصیهٔ ما: الف — حدس زدنِ دوره، خلافِ قاعدهٔ طلایی است.</w:t>
-      </w:r>
-    </w:p>
-    <w:tbl>
-      <w:tblPr>
-        <w:tblStyle w:val="TableGrid"/>
-        <w:tblW w:type="auto" w:w="0"/>
-        <w:tblLook w:firstColumn="1" w:firstRow="1" w:lastColumn="0" w:lastRow="0" w:noHBand="0" w:noVBand="1" w:val="04A0"/>
-      </w:tblPr>
-      <w:tblGrid>
-        <w:gridCol w:w="2880"/>
-        <w:gridCol w:w="2880"/>
-        <w:gridCol w:w="2880"/>
-      </w:tblGrid>
-      <w:tr>
-        <w:tc>
-          <w:tcPr>
-            <w:tcW w:type="dxa" w:w="2880"/>
-          </w:tcPr>
-          <w:p>
-            <w:pPr>
-              <w:bidi/>
-              <w:jc w:val="right"/>
-            </w:pPr>
-            <w:r>
-              <w:rPr>
-                <w:b/>
-              </w:rPr>
-              <w:t>تصمیم</w:t>
-            </w:r>
-          </w:p>
-        </w:tc>
-        <w:tc>
-          <w:tcPr>
-            <w:tcW w:type="dxa" w:w="2880"/>
-          </w:tcPr>
-          <w:p>
-            <w:pPr>
-              <w:bidi/>
-              <w:jc w:val="right"/>
-            </w:pPr>
-            <w:r>
-              <w:rPr>
-                <w:b/>
-              </w:rPr>
-              <w:t>امضا</w:t>
-            </w:r>
-          </w:p>
-        </w:tc>
-        <w:tc>
-          <w:tcPr>
-            <w:tcW w:type="dxa" w:w="2880"/>
-          </w:tcPr>
-          <w:p>
-            <w:pPr>
-              <w:bidi/>
-              <w:jc w:val="right"/>
-            </w:pPr>
-            <w:r>
-              <w:rPr>
-                <w:b/>
-              </w:rPr>
-              <w:t>تاریخ</w:t>
-            </w:r>
-          </w:p>
-        </w:tc>
-      </w:tr>
-      <w:tr>
-        <w:tc>
-          <w:tcPr>
-            <w:tcW w:type="dxa" w:w="2880"/>
-          </w:tcPr>
-          <w:p/>
-        </w:tc>
-        <w:tc>
-          <w:tcPr>
-            <w:tcW w:type="dxa" w:w="2880"/>
-          </w:tcPr>
-          <w:p/>
-        </w:tc>
-        <w:tc>
-          <w:tcPr>
-            <w:tcW w:type="dxa" w:w="2880"/>
-          </w:tcPr>
-          <w:p/>
-        </w:tc>
-      </w:tr>
-    </w:tbl>
-    <w:p/>
-    <w:p>
-      <w:pPr>
-        <w:bidi/>
-        <w:spacing w:after="120"/>
-        <w:jc w:val="right"/>
-      </w:pPr>
-      <w:r>
-        <w:rPr>
-          <w:b/>
-          <w:sz w:val="26"/>
-        </w:rPr>
-        <w:t>D-16 — روشِ نامعتبرِ کارِ جدید</w:t>
-      </w:r>
-    </w:p>
-    <w:p>
-      <w:pPr>
-        <w:bidi/>
-        <w:spacing w:after="120"/>
-        <w:jc w:val="right"/>
-      </w:pPr>
-      <w:r>
-        <w:rPr>
-          <w:b w:val="0"/>
-          <w:sz w:val="18"/>
-        </w:rPr>
-        <w:t>بند/مرجع: بندهای ۳-۱ تا ۳-۵</w:t>
-      </w:r>
-    </w:p>
-    <w:p>
-      <w:pPr>
-        <w:bidi/>
-        <w:spacing w:after="120"/>
-        <w:jc w:val="right"/>
-      </w:pPr>
-      <w:r>
-        <w:rPr>
-          <w:b w:val="0"/>
-        </w:rPr>
-        <w:t>سؤال: اگر روشِ قیمت‌گذاریِ کارِ جدید مجاز نبود چه شود؟</w:t>
-      </w:r>
-    </w:p>
-    <w:p>
-      <w:pPr>
-        <w:bidi/>
-        <w:spacing w:after="120"/>
-        <w:jc w:val="right"/>
-      </w:pPr>
-      <w:r>
-        <w:rPr>
-          <w:b w:val="0"/>
-        </w:rPr>
-        <w:t>گزینهٔ الف: برگشت به روشِ «فهرست پیمان». الان پیاده شده.</w:t>
-      </w:r>
-    </w:p>
-    <w:p>
-      <w:pPr>
-        <w:bidi/>
-        <w:spacing w:after="120"/>
-        <w:jc w:val="right"/>
-      </w:pPr>
-      <w:r>
-        <w:rPr>
-          <w:b w:val="0"/>
-        </w:rPr>
-        <w:t>گزینهٔ ب: خطا و توقفِ موتور.</w:t>
-      </w:r>
-    </w:p>
-    <w:p>
-      <w:pPr>
-        <w:bidi/>
-        <w:spacing w:after="120"/>
-        <w:jc w:val="right"/>
-      </w:pPr>
-      <w:r>
-        <w:rPr>
-          <w:b w:val="0"/>
-        </w:rPr>
-        <w:t>اثرِ عددی: صفر.</w:t>
-      </w:r>
-    </w:p>
-    <w:p>
-      <w:pPr>
-        <w:bidi/>
-        <w:spacing w:after="120"/>
-        <w:jc w:val="right"/>
-      </w:pPr>
-      <w:r>
-        <w:rPr>
-          <w:b w:val="0"/>
-        </w:rPr>
-        <w:t>توصیهٔ ما: الف — ادامه با یک پیش‌فرضِ مکتوب بهتر از توقف است.</w:t>
       </w:r>
     </w:p>
     <w:tbl>

</xml_diff>